<commit_message>
Them model routing 3 tang (Haiku) va song song hoa buoc doc lap
- CLAUDE.md 13.1b: downshift task co hoc co template sang Haiku, giu Two-Eyes cho buoc review/approve
- CLAUDE.md 4 / RULES.md 3.4 / CORE.md 7-7b: ky hieu song song hoa (||) cho cap buoc doc lap (SD||JD, UXR||QAE, BA||TL), dieu kien bat buoc va cam ap dung cho cap review/approve
- WORKFLOW.md: them Vi du 9 minh hoa QA Engineer || UX/UI Reviewer
- Lay cam hung tu nghien cuu Ruflo/Claude Flow (3-tier model routing + parallel agent execution)

Co-Authored-By: Claude Sonnet 5 <noreply@anthropic.com>
</commit_message>
<xml_diff>
--- a/.claude/shared/CORE.docx
+++ b/.claude/shared/CORE.docx
@@ -2633,6 +2633,54 @@
           </w:p>
         </w:tc>
       </w:tr>
+      <w:tr>
+        <w:tc>
+          <w:tcPr>
+            <w:tcW w:type="dxa" w:w="4844"/>
+            <w:tcBorders>
+              <w:top w:val="single" w:sz="4" w:space="0" w:color="CBCBCB"/>
+              <w:left w:val="single" w:sz="4" w:space="0" w:color="CBCBCB"/>
+              <w:bottom w:val="single" w:sz="4" w:space="0" w:color="CBCBCB"/>
+              <w:right w:val="single" w:sz="4" w:space="0" w:color="CBCBCB"/>
+            </w:tcBorders>
+          </w:tcPr>
+          <w:p>
+            <w:r>
+              <w:rPr>
+                <w:sz w:val="20"/>
+              </w:rPr>
+              <w:t>Task cơ học có template (smoke-test log, deploy checklist, MD→DOCX, CRUD lặp lại đã có pattern)</w:t>
+            </w:r>
+          </w:p>
+        </w:tc>
+        <w:tc>
+          <w:tcPr>
+            <w:tcW w:type="dxa" w:w="4844"/>
+            <w:tcBorders>
+              <w:top w:val="single" w:sz="4" w:space="0" w:color="CBCBCB"/>
+              <w:left w:val="single" w:sz="4" w:space="0" w:color="CBCBCB"/>
+              <w:bottom w:val="single" w:sz="4" w:space="0" w:color="CBCBCB"/>
+              <w:right w:val="single" w:sz="4" w:space="0" w:color="CBCBCB"/>
+            </w:tcBorders>
+          </w:tcPr>
+          <w:p>
+            <w:r>
+              <w:rPr>
+                <w:rFonts w:ascii="Courier New" w:hAnsi="Courier New"/>
+                <w:color w:val="F05922"/>
+                <w:sz w:val="20"/>
+              </w:rPr>
+              <w:t>claude-haiku-4-5</w:t>
+            </w:r>
+            <w:r>
+              <w:rPr>
+                <w:sz w:val="20"/>
+              </w:rPr>
+              <w:t xml:space="preserve"> — downshift theo §13.1b CLAUDE.md; KHÔNG áp dụng cho bước review/approve</w:t>
+            </w:r>
+          </w:p>
+        </w:tc>
+      </w:tr>
     </w:tbl>
     <w:p/>
     <w:p>
@@ -2643,7 +2691,81 @@
         <w:rPr>
           <w:sz w:val="21"/>
         </w:rPr>
-        <w:t>Không tự nâng model — escalate lên agent cấp cao hơn.</w:t>
+        <w:t>Không tự nâng model — escalate lên agent cấp cao hơn. Downshift xuống Haiku là tự quyết theo bảng trên, không cần hỏi user; task đầu tiên của 1 pattern mới vẫn dùng model mặc định.</w:t>
+      </w:r>
+    </w:p>
+    <w:p>
+      <w:pPr>
+        <w:pBdr>
+          <w:bottom w:val="single" w:sz="6" w:space="1" w:color="F05922"/>
+        </w:pBdr>
+        <w:spacing w:after="120"/>
+      </w:pPr>
+    </w:p>
+    <w:p>
+      <w:pPr>
+        <w:pStyle w:val="Heading2"/>
+        <w:spacing w:before="200" w:after="80"/>
+      </w:pPr>
+      <w:r>
+        <w:rPr>
+          <w:color w:val="F05922"/>
+          <w:sz w:val="28"/>
+        </w:rPr>
+        <w:t>7b. Song song hoá (Parallel Execution)</w:t>
+      </w:r>
+    </w:p>
+    <w:p>
+      <w:pPr>
+        <w:spacing w:after="80"/>
+      </w:pPr>
+      <w:r>
+        <w:rPr>
+          <w:sz w:val="21"/>
+        </w:rPr>
+        <w:t xml:space="preserve">Khi 2 bước trong 1 workflow ĐỘC LẬP nhau (cùng nhận input từ 1 bước trước, không bên nào review/approve bên kia) → được phép gọi nhiều subagent trong CÙNG 1 lời gọi Agent tool thay vì tuần tự. Ký hiệu </w:t>
+      </w:r>
+      <w:r>
+        <w:rPr>
+          <w:rFonts w:ascii="Courier New" w:hAnsi="Courier New"/>
+          <w:color w:val="F05922"/>
+          <w:sz w:val="18"/>
+        </w:rPr>
+        <w:t>∥</w:t>
+      </w:r>
+      <w:r>
+        <w:rPr>
+          <w:sz w:val="21"/>
+        </w:rPr>
+        <w:t xml:space="preserve"> trong bảng workflow (</w:t>
+      </w:r>
+      <w:r>
+        <w:rPr>
+          <w:rFonts w:ascii="Courier New" w:hAnsi="Courier New"/>
+          <w:color w:val="F05922"/>
+          <w:sz w:val="18"/>
+        </w:rPr>
+        <w:t>CLAUDE.md</w:t>
+      </w:r>
+      <w:r>
+        <w:rPr>
+          <w:sz w:val="21"/>
+        </w:rPr>
+        <w:t xml:space="preserve"> §4). Điều kiện đầy đủ: </w:t>
+      </w:r>
+      <w:r>
+        <w:rPr>
+          <w:rFonts w:ascii="Courier New" w:hAnsi="Courier New"/>
+          <w:color w:val="F05922"/>
+          <w:sz w:val="18"/>
+        </w:rPr>
+        <w:t>RULES.md</w:t>
+      </w:r>
+      <w:r>
+        <w:rPr>
+          <w:sz w:val="21"/>
+        </w:rPr>
+        <w:t xml:space="preserve"> §3.4. TUYỆT ĐỐI KHÔNG song song hoá cặp bước có quan hệ review/approve (vi phạm Two-Eyes).</w:t>
       </w:r>
     </w:p>
     <w:p>

</xml_diff>

<commit_message>
Thêm agent github-repo-researcher: nghiên cứu repo GitHub theo yêu cầu
- Tạo .claude/agents/github-repo-researcher.md: agent tạo nhánh nghiên cứu,
  clone repo ngoài, phân tích, đề xuất cải tiến, chờ user xác nhận trước khi
  áp dụng và merge về main.
- Đồng bộ org chart, bảng routing, workflow WF-GITHUB-RESEARCH và bảng model
  trong CLAUDE.md, .claude/shared/CORE.md, RULES.md, WORKFLOW.md theo §10
  CLAUDE.md.
</commit_message>
<xml_diff>
--- a/.claude/shared/CORE.docx
+++ b/.claude/shared/CORE.docx
@@ -130,7 +130,9 @@
         <w:br/>
         <w:t>│   ├── Tech Lead (L3) → Senior Dev (L4) → Junior Dev (L5)</w:t>
         <w:br/>
-        <w:t>│   │   └── Code Migrator (L4, Opus khi lập plan) ← CHỈ khi user yêu cầu migrate code</w:t>
+        <w:t>│   │   ├── Code Migrator (L4, Opus khi lập plan) ← CHỈ khi user yêu cầu migrate code</w:t>
+        <w:br/>
+        <w:t>│   │   └── GitHub Repo Researcher (L4, Sonnet) ← CHỈ khi user gửi link GitHub nghiên cứu</w:t>
         <w:br/>
         <w:t>│   ├── QA Lead (L3) → QA Engineer (L5)</w:t>
         <w:br/>
@@ -1286,6 +1288,68 @@
                 <w:sz w:val="20"/>
               </w:rPr>
               <w:t>CODE-MIGRATOR (plan, Opus)→SD/JD (code, Sonnet)→CODE-MIGRATOR (review)→QAE — CHỈ khi user yêu cầu</w:t>
+            </w:r>
+          </w:p>
+        </w:tc>
+      </w:tr>
+      <w:tr>
+        <w:tc>
+          <w:tcPr>
+            <w:tcW w:type="dxa" w:w="3230"/>
+            <w:shd w:val="clear" w:color="auto" w:fill="B8B3D6"/>
+            <w:tcBorders>
+              <w:top w:val="single" w:sz="4" w:space="0" w:color="CBCBCB"/>
+              <w:left w:val="single" w:sz="4" w:space="0" w:color="CBCBCB"/>
+              <w:bottom w:val="single" w:sz="4" w:space="0" w:color="CBCBCB"/>
+              <w:right w:val="single" w:sz="4" w:space="0" w:color="CBCBCB"/>
+            </w:tcBorders>
+          </w:tcPr>
+          <w:p>
+            <w:r>
+              <w:rPr>
+                <w:sz w:val="20"/>
+              </w:rPr>
+              <w:t>Nghiên cứu repo GitHub (user gửi link)</w:t>
+            </w:r>
+          </w:p>
+        </w:tc>
+        <w:tc>
+          <w:tcPr>
+            <w:tcW w:type="dxa" w:w="3230"/>
+            <w:shd w:val="clear" w:color="auto" w:fill="B8B3D6"/>
+            <w:tcBorders>
+              <w:top w:val="single" w:sz="4" w:space="0" w:color="CBCBCB"/>
+              <w:left w:val="single" w:sz="4" w:space="0" w:color="CBCBCB"/>
+              <w:bottom w:val="single" w:sz="4" w:space="0" w:color="CBCBCB"/>
+              <w:right w:val="single" w:sz="4" w:space="0" w:color="CBCBCB"/>
+            </w:tcBorders>
+          </w:tcPr>
+          <w:p>
+            <w:r>
+              <w:rPr>
+                <w:sz w:val="20"/>
+              </w:rPr>
+              <w:t>WF-GITHUB-RESEARCH</w:t>
+            </w:r>
+          </w:p>
+        </w:tc>
+        <w:tc>
+          <w:tcPr>
+            <w:tcW w:type="dxa" w:w="3230"/>
+            <w:shd w:val="clear" w:color="auto" w:fill="B8B3D6"/>
+            <w:tcBorders>
+              <w:top w:val="single" w:sz="4" w:space="0" w:color="CBCBCB"/>
+              <w:left w:val="single" w:sz="4" w:space="0" w:color="CBCBCB"/>
+              <w:bottom w:val="single" w:sz="4" w:space="0" w:color="CBCBCB"/>
+              <w:right w:val="single" w:sz="4" w:space="0" w:color="CBCBCB"/>
+            </w:tcBorders>
+          </w:tcPr>
+          <w:p>
+            <w:r>
+              <w:rPr>
+                <w:sz w:val="20"/>
+              </w:rPr>
+              <w:t>GITHUB-REPO-RESEARCHER (nhánh→clone→nghiên cứu→đề xuất)→user duyệt→áp dụng→user xác nhận merge→main — CHỈ khi user gửi link</w:t>
             </w:r>
           </w:p>
         </w:tc>
@@ -2606,7 +2670,7 @@
               <w:rPr>
                 <w:sz w:val="20"/>
               </w:rPr>
-              <w:t>Tất cả còn lại</w:t>
+              <w:t>GitHub Repo Researcher</w:t>
             </w:r>
           </w:p>
         </w:tc>
@@ -2630,6 +2694,12 @@
               </w:rPr>
               <w:t>claude-sonnet-4-6</w:t>
             </w:r>
+            <w:r>
+              <w:rPr>
+                <w:sz w:val="20"/>
+              </w:rPr>
+              <w:t xml:space="preserve"> — CHỈ hoạt động khi user gửi link GitHub</w:t>
+            </w:r>
           </w:p>
         </w:tc>
       </w:tr>
@@ -2649,6 +2719,49 @@
               <w:rPr>
                 <w:sz w:val="20"/>
               </w:rPr>
+              <w:t>Tất cả còn lại</w:t>
+            </w:r>
+          </w:p>
+        </w:tc>
+        <w:tc>
+          <w:tcPr>
+            <w:tcW w:type="dxa" w:w="4844"/>
+            <w:tcBorders>
+              <w:top w:val="single" w:sz="4" w:space="0" w:color="CBCBCB"/>
+              <w:left w:val="single" w:sz="4" w:space="0" w:color="CBCBCB"/>
+              <w:bottom w:val="single" w:sz="4" w:space="0" w:color="CBCBCB"/>
+              <w:right w:val="single" w:sz="4" w:space="0" w:color="CBCBCB"/>
+            </w:tcBorders>
+          </w:tcPr>
+          <w:p>
+            <w:r>
+              <w:rPr>
+                <w:rFonts w:ascii="Courier New" w:hAnsi="Courier New"/>
+                <w:color w:val="F05922"/>
+                <w:sz w:val="20"/>
+              </w:rPr>
+              <w:t>claude-sonnet-4-6</w:t>
+            </w:r>
+          </w:p>
+        </w:tc>
+      </w:tr>
+      <w:tr>
+        <w:tc>
+          <w:tcPr>
+            <w:tcW w:type="dxa" w:w="4844"/>
+            <w:shd w:val="clear" w:color="auto" w:fill="B8B3D6"/>
+            <w:tcBorders>
+              <w:top w:val="single" w:sz="4" w:space="0" w:color="CBCBCB"/>
+              <w:left w:val="single" w:sz="4" w:space="0" w:color="CBCBCB"/>
+              <w:bottom w:val="single" w:sz="4" w:space="0" w:color="CBCBCB"/>
+              <w:right w:val="single" w:sz="4" w:space="0" w:color="CBCBCB"/>
+            </w:tcBorders>
+          </w:tcPr>
+          <w:p>
+            <w:r>
+              <w:rPr>
+                <w:sz w:val="20"/>
+              </w:rPr>
               <w:t>Task cơ học có template (smoke-test log, deploy checklist, MD→DOCX, CRUD lặp lại đã có pattern)</w:t>
             </w:r>
           </w:p>
@@ -2656,6 +2769,7 @@
         <w:tc>
           <w:tcPr>
             <w:tcW w:type="dxa" w:w="4844"/>
+            <w:shd w:val="clear" w:color="auto" w:fill="B8B3D6"/>
             <w:tcBorders>
               <w:top w:val="single" w:sz="4" w:space="0" w:color="CBCBCB"/>
               <w:left w:val="single" w:sz="4" w:space="0" w:color="CBCBCB"/>

</xml_diff>

<commit_message>
Cap nhat model agent sang the he Claude 5 (Opus 5 / Sonnet 5)
- claude-opus-4-7 -> claude-opus-5: cto, tech-lead, code-migrator
- claude-sonnet-4-6 -> claude-sonnet-5: 16 agent con lai
- CORE.md §7, CLAUDE.md §13.1, §13.1b, §18.5, changelog v1.4
- writing-agent-skill.md: template frontmatter
- agents-view.html: model entries + nhan hien thi Opus 5 / Sonnet 5
- Giu claude-haiku-4-5 cho Tang 3 (van la ban Haiku moi nhat)
- Xuat lai DOCX/PDF cho cac file .md thay doi

Co-Authored-By: Claude Opus 5 (1M context) <noreply@anthropic.com>
</commit_message>
<xml_diff>
--- a/.claude/shared/CORE.docx
+++ b/.claude/shared/CORE.docx
@@ -4187,7 +4187,7 @@
                 <w:color w:val="F05922"/>
                 <w:sz w:val="20"/>
               </w:rPr>
-              <w:t>claude-opus-4-7</w:t>
+              <w:t>claude-opus-5</w:t>
             </w:r>
           </w:p>
         </w:tc>
@@ -4229,7 +4229,7 @@
                 <w:color w:val="F05922"/>
                 <w:sz w:val="20"/>
               </w:rPr>
-              <w:t>claude-opus-4-7</w:t>
+              <w:t>claude-opus-5</w:t>
             </w:r>
             <w:r>
               <w:rPr>
@@ -4279,7 +4279,7 @@
                 <w:color w:val="F05922"/>
                 <w:sz w:val="20"/>
               </w:rPr>
-              <w:t>claude-sonnet-4-6</w:t>
+              <w:t>claude-sonnet-5</w:t>
             </w:r>
             <w:r>
               <w:rPr>
@@ -4327,7 +4327,7 @@
                 <w:color w:val="F05922"/>
                 <w:sz w:val="20"/>
               </w:rPr>
-              <w:t>claude-sonnet-4-6</w:t>
+              <w:t>claude-sonnet-5</w:t>
             </w:r>
           </w:p>
         </w:tc>

</xml_diff>